<commit_message>
feat: rename project to KUVTH Zebrafish LIMS
Update application branding, export artifacts, package and container metadata, documentation, and embedded user-guide screenshots while retaining runtime compatibility identifiers.
</commit_message>
<xml_diff>
--- a/docs/CLOUD_DEPLOYMENT_RECOMMENDATION.docx
+++ b/docs/CLOUD_DEPLOYMENT_RECOMMENDATION.docx
@@ -43,7 +43,7 @@
         <w:jc w:val="center"/>
       </w:pPr>
       <w:r>
-        <w:t>คู่มือแนะนำ Cloud สำหรับการ Deploy ระบบ ChronoFish</w:t>
+        <w:t>คู่มือแนะนำ Cloud สำหรับการ Deploy ระบบ KUVTH Zebrafish LIMS</w:t>
       </w:r>
     </w:p>
     <w:p>
@@ -361,7 +361,7 @@
                 <w:color w:val="0B2545"/>
                 <w:sz w:val="21"/>
               </w:rPr>
-              <w:t>พื้นที่ดิสก์ไม่ใช่ตัวกำหนดต้นทุนหลักของ ChronoFish ในช่วง 1.5 ปี ต้นทุนจริงเกิดจาก RAM ของ API/Database, ความปลอดภัย, backup/restore, uptime และเวลาที่ทีมต้องใช้ดูแลระบบ</w:t>
+              <w:t>พื้นที่ดิสก์ไม่ใช่ตัวกำหนดต้นทุนหลักของ KUVTH Zebrafish LIMS ในช่วง 1.5 ปี ต้นทุนจริงเกิดจาก RAM ของ API/Database, ความปลอดภัย, backup/restore, uptime และเวลาที่ทีมต้องใช้ดูแลระบบ</w:t>
             </w:r>
           </w:p>
         </w:tc>
@@ -4791,7 +4791,7 @@
           <w:i/>
           <w:color w:val="5B6573"/>
         </w:rPr>
-        <w:t>คะแนนใช้สเกล 1-5 และเป็นการประเมินสำหรับ ChronoFish โดยเฉพาะ ไม่ใช่ ranking ทั่วไปของผู้ให้บริการ คะแนนอาจเปลี่ยนเมื่อทราบ SLA, procurement policy และผู้รับผิดชอบ operations ของลูกค้า</w:t>
+        <w:t>คะแนนใช้สเกล 1-5 และเป็นการประเมินสำหรับ KUVTH Zebrafish LIMS โดยเฉพาะ ไม่ใช่ ranking ทั่วไปของผู้ให้บริการ คะแนนอาจเปลี่ยนเมื่อทราบ SLA, procurement policy และผู้รับผิดชอบ operations ของลูกค้า</w:t>
       </w:r>
     </w:p>
     <w:p>
@@ -7103,7 +7103,7 @@
                 <w:color w:val="0B2545"/>
                 <w:sz w:val="21"/>
               </w:rPr>
-              <w:t>เทคนิคแข็งแรงและขยายได้ดี แต่ซับซ้อนเกินความจำเป็นหาก ChronoFish เป็นระบบภายในเพียงระบบเดียวและทีมไม่มี GCP อยู่แล้ว</w:t>
+              <w:t>เทคนิคแข็งแรงและขยายได้ดี แต่ซับซ้อนเกินความจำเป็นหาก KUVTH Zebrafish LIMS เป็นระบบภายในเพียงระบบเดียวและทีมไม่มี GCP อยู่แล้ว</w:t>
             </w:r>
           </w:p>
         </w:tc>
@@ -7715,7 +7715,7 @@
         <w:pStyle w:val="Heading1"/>
       </w:pPr>
       <w:r>
-        <w:t>7. คะแนนสรุปสำหรับ ChronoFish</w:t>
+        <w:t>7. คะแนนสรุปสำหรับ KUVTH Zebrafish LIMS</w:t>
       </w:r>
     </w:p>
     <w:tbl>
@@ -11433,7 +11433,7 @@
           <w:rFonts w:ascii="Tahoma" w:hAnsi="Tahoma" w:eastAsia="Tahoma"/>
           <w:i w:val="0"/>
         </w:rPr>
-        <w:t>ChronoFish ไม่ต้องการ cloud ขนาดใหญ่ในช่วงเริ่มต้น ข้อมูล 1.5 ปีมีขนาดไม่กี่ GB และสามารถเริ่มจาก PostgreSQL 10 GB ได้อย่างปลอดภัย หากมี RAM และ backup ที่เหมาะสม การเลือก provider จึงควรตัดสินจากความสามารถในการกู้คืน ความง่ายในการดูแล ความปลอดภัยของเครือข่าย และเจ้าของภาระ operations มากกว่าราคาพื้นที่ storage</w:t>
+        <w:t>KUVTH Zebrafish LIMS ไม่ต้องการ cloud ขนาดใหญ่ในช่วงเริ่มต้น ข้อมูล 1.5 ปีมีขนาดไม่กี่ GB และสามารถเริ่มจาก PostgreSQL 10 GB ได้อย่างปลอดภัย หากมี RAM และ backup ที่เหมาะสม การเลือก provider จึงควรตัดสินจากความสามารถในการกู้คืน ความง่ายในการดูแล ความปลอดภัยของเครือข่าย และเจ้าของภาระ operations มากกว่าราคาพื้นที่ storage</w:t>
       </w:r>
     </w:p>
     <w:tbl>
@@ -12255,7 +12255,7 @@
         <w:color w:val="5B6573"/>
         <w:sz w:val="16"/>
       </w:rPr>
-      <w:t xml:space="preserve">ChronoFish  |  24 August 2026  |  Page </w:t>
+      <w:t xml:space="preserve">KUVTH Zebrafish LIMS  |  24 August 2026  |  Page </w:t>
     </w:r>
     <w:r>
       <w:rPr>
@@ -12308,7 +12308,7 @@
         <w:color w:val="5B6573"/>
         <w:sz w:val="16"/>
       </w:rPr>
-      <w:t>CHRONOFISH  |  CLOUD DEPLOYMENT RECOMMENDATION</w:t>
+      <w:t>KUVTH ZEBRAFISH LIMS  |  CLOUD DEPLOYMENT RECOMMENDATION</w:t>
     </w:r>
   </w:p>
 </w:hdr>

</xml_diff>